<commit_message>
Second review round: anchor on pump setting at T, conditional overlap (65%), policy bootstrap CIs, cross-model check, E7 selection on validation, exploratory labelling, remove dead repo link
</commit_message>
<xml_diff>
--- a/report/cover/cover_filled.docx
+++ b/report/cover/cover_filled.docx
@@ -489,7 +489,7 @@
           <w:p>
             <w:r/>
             <w:r>
-              <w:t>https://github.com/Ean214/md6329-idh-uf-control</w:t>
+              <w:t>Code and data-processing scripts are provided in the supplementary ZIP (src/). No public repository is linked.</w:t>
             </w:r>
           </w:p>
         </w:tc>
@@ -623,7 +623,7 @@
           <w:p>
             <w:r/>
             <w:r>
-              <w:t>https://github.com/Ean214/md6329-idh-uf-control/tree/main/lectrace</w:t>
+              <w:t>lectrace/md6329_idh_control.py in the supplementary ZIP (run: lectrace serve)</w:t>
             </w:r>
           </w:p>
         </w:tc>

</xml_diff>

<commit_message>
Cover: link the public repository; rebuild report and ZIP
</commit_message>
<xml_diff>
--- a/report/cover/cover_filled.docx
+++ b/report/cover/cover_filled.docx
@@ -489,7 +489,7 @@
           <w:p>
             <w:r/>
             <w:r>
-              <w:t>Code and data-processing scripts are provided in the supplementary ZIP (src/). No public repository is linked.</w:t>
+              <w:t>https://github.com/Ean214/MD6329</w:t>
             </w:r>
           </w:p>
         </w:tc>
@@ -623,7 +623,7 @@
           <w:p>
             <w:r/>
             <w:r>
-              <w:t>lectrace/md6329_idh_control.py in the supplementary ZIP (run: lectrace serve)</w:t>
+              <w:t>https://github.com/Ean214/MD6329/tree/main/lectrace</w:t>
             </w:r>
           </w:p>
         </w:tc>

</xml_diff>